<commit_message>
docs(infra, CH-010): complete the requestor-owned fields on the PAR
Department RAPO IT; Project Manager Dewey Lou; technical contact Chris Lai.
No [TO BE COMPLETED] marker remains.

The number of internal users was already filled by hand as [50-100] — the
script stopped rather than overwrite it, which is why that entry survived.

⚠️ Number of Administrators (3-5) is an assumption, flagged as one in the
notes: 50-100 total users was given, the administrator subset was not, and
3-5 follows from the six-role model in 15-design-alignment.md §5.1.

Still open before submission: the integration Yes/No contradiction (§4b), the
request date, and a pagination check in Word.

Co-Authored-By: Claude Opus 5 (1M context) <noreply@anthropic.com>
</commit_message>
<xml_diff>
--- a/docs/06-reference/02-azure-resource-request-form/PAR-APAC-ISMS-Governance-Platform-2026-08-09.docx
+++ b/docs/06-reference/02-azure-resource-request-form/PAR-APAC-ISMS-Governance-Platform-2026-08-09.docx
@@ -1591,9 +1591,9 @@
               <w:rPr>
                 <w:rFonts w:ascii="Calibri" w:hAnsi="Calibri"/>
                 <w:b w:val="0"/>
-                <w:color w:val="B03010"/>
-              </w:rPr>
-              <w:t xml:space="preserve"> [TO BE COMPLETED BY REQUESTOR]</w:t>
+                <w:color w:val="1F3D7A"/>
+              </w:rPr>
+              <w:t xml:space="preserve"> RAPO IT</w:t>
             </w:r>
           </w:p>
         </w:tc>
@@ -1827,9 +1827,9 @@
               <w:rPr>
                 <w:rFonts w:ascii="Calibri" w:hAnsi="Calibri"/>
                 <w:b w:val="0"/>
-                <w:color w:val="B03010"/>
-              </w:rPr>
-              <w:t xml:space="preserve"> [TO BE COMPLETED BY REQUESTOR]</w:t>
+                <w:color w:val="1F3D7A"/>
+              </w:rPr>
+              <w:t xml:space="preserve"> Dewey Lou</w:t>
             </w:r>
           </w:p>
         </w:tc>
@@ -1894,9 +1894,9 @@
             <w:r>
               <w:rPr>
                 <w:rFonts w:ascii="Calibri" w:hAnsi="Calibri"/>
-                <w:color w:val="B03010"/>
-              </w:rPr>
-              <w:t xml:space="preserve"> [TO BE COMPLETED BY REQUESTOR]</w:t>
+                <w:color w:val="1F3D7A"/>
+              </w:rPr>
+              <w:t xml:space="preserve"> Chris Lai</w:t>
             </w:r>
           </w:p>
         </w:tc>
@@ -7586,8 +7586,9 @@
                       <w:rPr>
                         <w:rStyle w:val="PlaceholderText"/>
                         <w:szCs w:val="21"/>
+                        <w:color w:val="1F3D7A"/>
                       </w:rPr>
-                      <w:t>[TO BE COMPLETED BY REQUESTOR]</w:t>
+                      <w:t xml:space="preserve">3–5  (Platform Admin + Regional ISO — the administrator subset of the users below)</w:t>
                     </w:r>
                   </w:sdtContent>
                 </w:sdt>

</xml_diff>